<commit_message>
Add bounded AWS anomaly demo with measured evidence and report
</commit_message>
<xml_diff>
--- a/docs/Digital_Banking_Cloud_Project_Final_Report.docx
+++ b/docs/Digital_Banking_Cloud_Project_Final_Report.docx
@@ -244,7 +244,7 @@
         <w:rPr>
           <w:color w:val="000000"/>
         </w:rPr>
-        <w:t>Digital banking transactions depend on interconnected application and data services whose performance degradation can be difficult to localize from aggregate response-time measurements. This project presents an explainable cloud-performance investigation platform with an instrumented academic banking workload, recorded microservice benchmarks, and AWS observability. Three local FastAPI services implement balance enquiry, atomic test fund transfer, and transaction history using dedicated SQLite storage. Actual HTTP and SQL timings support chronological anomaly detection, trace-based service localization, evidence-qualified explanations, conditional recommendations, and independent verification. The frozen local study recorded 270 normal requests and three bounded application-delay repetitions; no false-positive requests occurred among 54 held-out normal requests. All three controlled cases were detected and correctly localized, with measured return toward the frozen reference. The graph model produced held-out next-request mean-squared error of 0.575263 against 0.574412 for the feature-only model, providing no established graph advantage. The AWS extension explicitly published ten existing measured banking requests as 118 metric values to ExplainableAI/Banking in us-east-1. CloudWatch subsequently returned 30 service-operation metric series across eight metric types. The dashboard displays these measurements with local-workload provenance, publication checkpoint status, and missing-data evidence. AWS discovery found one running EC2 instance and no RDS databases. The published subset contains insufficient independent minute windows for cloud anomaly or root-cause validation; cloud-hosted banking and causal recovery are not established. Historical Alibaba, Microsoft, and RCAEval results remain separate and unchanged.</w:t>
+        <w:t>Digital banking transactions depend on interconnected application and data services whose performance degradation can be difficult to localize from aggregate response-time measurements. This project presents an explainable cloud-performance investigation platform with an instrumented academic banking workload, recorded microservice benchmarks, and AWS observability. Three local FastAPI services implement balance enquiry, atomic test fund transfer, and transaction history using dedicated SQLite storage. Actual HTTP and SQL timings support chronological anomaly detection, trace-based service localization, evidence-qualified explanations, conditional recommendations, and independent verification. The frozen local study recorded 270 normal requests and three bounded application-delay repetitions; no false-positive requests occurred among 54 held-out normal requests. All three controlled cases were detected and correctly localized, with measured return toward the frozen reference. The graph model produced held-out next-request mean-squared error of 0.575263 against 0.574412 for the feature-only model, providing no established graph advantage. The AWS extension explicitly published ten existing measured banking requests as 118 metric values to ExplainableAI/Banking in us-east-1. CloudWatch subsequently returned 30 service-operation metric series across eight metric types. The dashboard displays these measurements with local-workload provenance, publication checkpoint status, and missing-data evidence. AWS discovery found one running EC2 instance and no RDS databases. The published subset contains insufficient independent minute windows for cloud anomaly or root-cause validation; cloud-hosted banking and causal recovery are not established. Historical Alibaba, Microsoft, and RCAEval results remain separate and unchanged. A separately authorized high-resolution demonstration then established forty normal requests across ten complete 10-second periods, froze the reference, and evaluated eight controlled-delay and twelve follow-up transfers. Its measured outcome was abnormal latency detected, with causal root cause remaining unconfirmed.</w:t>
       </w:r>
     </w:p>
     <w:p>
@@ -376,7 +376,7 @@
       <w:r>
         <w:t>8. Methodology</w:t>
         <w:tab/>
-        <w:t>14</w:t>
+        <w:t>15</w:t>
       </w:r>
     </w:p>
     <w:p>
@@ -389,7 +389,7 @@
       <w:r>
         <w:t>9. Implementation and Development</w:t>
         <w:tab/>
-        <w:t>16</w:t>
+        <w:t>18</w:t>
       </w:r>
     </w:p>
     <w:p>
@@ -402,7 +402,7 @@
       <w:r>
         <w:t>10. Testing, Results, and Observations</w:t>
         <w:tab/>
-        <w:t>20</w:t>
+        <w:t>24</w:t>
       </w:r>
     </w:p>
     <w:p>
@@ -415,7 +415,7 @@
       <w:r>
         <w:t>11. Discussion, Limitations, and Risk Analysis</w:t>
         <w:tab/>
-        <w:t>23</w:t>
+        <w:t>27</w:t>
       </w:r>
     </w:p>
     <w:p>
@@ -428,7 +428,7 @@
       <w:r>
         <w:t>12. Team Contribution and GitHub Management</w:t>
         <w:tab/>
-        <w:t>24</w:t>
+        <w:t>28</w:t>
       </w:r>
     </w:p>
     <w:p>
@@ -441,7 +441,7 @@
       <w:r>
         <w:t>13. Conclusion and Future Enhancements</w:t>
         <w:tab/>
-        <w:t>25</w:t>
+        <w:t>29</w:t>
       </w:r>
     </w:p>
     <w:p>
@@ -454,7 +454,7 @@
       <w:r>
         <w:t>References</w:t>
         <w:tab/>
-        <w:t>26</w:t>
+        <w:t>30</w:t>
       </w:r>
     </w:p>
     <w:p>
@@ -467,7 +467,7 @@
       <w:r>
         <w:t>Appendix A. Reproducibility and Recorded Artifacts</w:t>
         <w:tab/>
-        <w:t>28</w:t>
+        <w:t>32</w:t>
       </w:r>
     </w:p>
     <w:p>
@@ -480,7 +480,7 @@
       <w:r>
         <w:t>Appendix B. Screenshot Evidence Register</w:t>
         <w:tab/>
-        <w:t>29</w:t>
+        <w:t>33</w:t>
       </w:r>
     </w:p>
     <w:p>
@@ -547,10 +547,7 @@
         <w:spacing w:after="0" w:line="240" w:lineRule="auto"/>
       </w:pPr>
       <w:r>
-        <w:rPr>
-          <w:color w:val="000000"/>
-        </w:rPr>
-        <w:t>Figures 5–9. Recorded application screenshots</w:t>
+        <w:t>Figures 5–11. Recorded application and AWS demonstration screenshots</w:t>
       </w:r>
     </w:p>
     <w:p>
@@ -6583,6 +6580,81 @@
     </w:p>
     <w:p>
       <w:pPr>
+        <w:pStyle w:val="Heading2"/>
+      </w:pPr>
+      <w:r>
+        <w:rPr>
+          <w:color w:val="000000"/>
+        </w:rPr>
+        <w:t>7.5 Optional High Resolution AWS Anomaly Demonstration</w:t>
+      </w:r>
+    </w:p>
+    <w:p>
+      <w:r>
+        <w:rPr>
+          <w:color w:val="000000"/>
+        </w:rPr>
+        <w:t>An optional, explicitly authorized demonstration uses StorageResolution=1 and 10-second GetMetricData periods in the separate academic-local-demo-10s environment. The default 60-second publisher and its checkpoint remain unchanged. Session creation captured the existing request backlog boundary at sequence 1180. Only new requests in the session manifest were published. Original source timestamps, measured counts, and service/operation provenance were preserved. Banking transaction logic, trained weights, frozen research artifacts, and historical tests were not changed.</w:t>
+      </w:r>
+    </w:p>
+    <w:p>
+      <w:r>
+        <w:rPr>
+          <w:color w:val="000000"/>
+        </w:rPr>
+        <w:t>The completed session faculty-aws-demo-20261016-02 recorded 60 actual one-cent fictitious test transfers through the existing local API: 40 normal observations, 8 observations during a bounded local application delay, and 12 subsequent observations. The normal reference covered ten complete consecutive 10-second periods, with four separately paced requests in each. Six chronological periods defined the robust reference and four provided calibration. CloudWatch counts and API/Ledger/SQL sample counts were matched to the original measured spans before readiness was declared. The reference was frozen at 2026-10-16T17:01:19.699967+00:00, before the local condition started.</w:t>
+      </w:r>
+    </w:p>
+    <w:p>
+      <w:r>
+        <w:rPr>
+          <w:color w:val="000000"/>
+        </w:rPr>
+        <w:t>Frozen medians and thresholds were Banking API latency: median 46.104 ms, MAD 1.783 ms, threshold 80.681 ms; Ledger exclusive processing: median 4.111 ms, MAD 0.610 ms, threshold 29.111 ms; SQL execution per measured request: median 30.576 ms, MAD 1.768 ms, threshold 55.576 ms. SQL time is derived from the sum of genuine SQL spans divided by the measured request count. Each feature remains a separate item of evidence.</w:t>
+      </w:r>
+    </w:p>
+    <w:p>
+      <w:r>
+        <w:rPr>
+          <w:color w:val="000000"/>
+        </w:rPr>
+        <w:t>The frozen-threshold detector identified a persistent deviation in the consecutive periods 2026-10-16T17:01:30+00:00, 2026-10-16T17:01:40+00:00. Both API latency and Ledger exclusive processing exceeded their respective thresholds, with complete matching sample counts. The affected service was ledger-service. Normalized feature scores for the detected periods were API 5.794, Ledger 8.012, SQL/request -0.066; API 5.553, Ledger 8.039, SQL/request -0.331. These predictions used the frozen reference and CloudWatch observations, without the control annotation or GNN weights. Confirmed causal root cause remains not_established.</w:t>
+      </w:r>
+    </w:p>
+    <w:p>
+      <w:r>
+        <w:rPr>
+          <w:color w:val="000000"/>
+        </w:rPr>
+        <w:t>Independent timestamp-matched local span corroboration covered 8 measured requests in the detected periods. Mean API handler time was 242.274 ms; exclusive Ledger processing was 204.749 ms; and summed SQL execution per request was 25.617 ms. The observed pattern supports the affected-service finding while preserving the distinction between a measured application wait and verified physical causality.</w:t>
+      </w:r>
+    </w:p>
+    <w:p>
+      <w:r>
+        <w:rPr>
+          <w:color w:val="000000"/>
+        </w:rPr>
+        <w:t>The subsequent CloudWatch result was measured_return_toward_frozen_reference. The consecutive follow-up periods were 2026-10-16T17:01:50+00:00, 2026-10-16T17:02:00+00:00. This is measured return toward the frozen reference, not proof of causal recovery. The existing local 270-request study and its three historical controlled repetitions remain separate from this newly executed AWS demonstration.</w:t>
+      </w:r>
+    </w:p>
+    <w:p>
+      <w:r>
+        <w:rPr>
+          <w:color w:val="000000"/>
+        </w:rPr>
+        <w:t>The demo confirmed publication of 60 newly measured requests as 900 raw metric values. CloudWatch collection status was observations_available, with 15 complete observed periods and 0 API errors. The evidence report retains all bucket timestamps, baseline statistics, feature scores, sample counts, local trace corroboration, and post-condition readings. A preliminary attempt was stopped after eight transfers because publication latency disrupted the next period's sample pacing; four requests had been published and no controlled delay started. That failed attempt is preserved and excluded from the completed session. Publication was subsequently moved outside timed measurement phases, and a newly authorized session was used.</w:t>
+      </w:r>
+    </w:p>
+    <w:p>
+      <w:r>
+        <w:rPr>
+          <w:color w:val="000000"/>
+        </w:rPr>
+        <w:t>This small controlled demonstration establishes an executable integration and observed deviation under one deliberately introduced local mechanism. It does not establish general anomaly accuracy, AWS-hosted banking, production causality, or a GNN advantage. Missing, incomplete, nonconsecutive or stale periods remain insufficient evidence. The optional dashboard shows the recorded snapshot time and age rather than representing saved results as a currently active fault.</w:t>
+      </w:r>
+    </w:p>
+    <w:p>
+      <w:pPr>
         <w:pStyle w:val="Heading1"/>
       </w:pPr>
       <w:r>
@@ -8476,6 +8548,112 @@
     </w:p>
     <w:p>
       <w:pPr>
+        <w:keepNext/>
+        <w:pageBreakBefore/>
+        <w:jc w:val="center"/>
+      </w:pPr>
+      <w:r>
+        <w:drawing>
+          <wp:inline xmlns:a="http://schemas.openxmlformats.org/drawingml/2006/main" xmlns:pic="http://schemas.openxmlformats.org/drawingml/2006/picture">
+            <wp:extent cx="5806440" cy="6686959"/>
+            <wp:docPr id="18" name="Picture 18"/>
+            <wp:cNvGraphicFramePr>
+              <a:graphicFrameLocks noChangeAspect="1"/>
+            </wp:cNvGraphicFramePr>
+            <a:graphic>
+              <a:graphicData uri="http://schemas.openxmlformats.org/drawingml/2006/picture">
+                <pic:pic>
+                  <pic:nvPicPr>
+                    <pic:cNvPr id="0" name="demo-baseline-detection.jpg"/>
+                    <pic:cNvPicPr/>
+                  </pic:nvPicPr>
+                  <pic:blipFill>
+                    <a:blip r:embed="rId25"/>
+                    <a:stretch>
+                      <a:fillRect/>
+                    </a:stretch>
+                  </pic:blipFill>
+                  <pic:spPr>
+                    <a:xfrm>
+                      <a:off x="0" y="0"/>
+                      <a:ext cx="5806440" cy="6686959"/>
+                    </a:xfrm>
+                    <a:prstGeom prst="rect"/>
+                  </pic:spPr>
+                </pic:pic>
+              </a:graphicData>
+            </a:graphic>
+          </wp:inline>
+        </w:drawing>
+      </w:r>
+    </w:p>
+    <w:p>
+      <w:pPr>
+        <w:pStyle w:val="Caption"/>
+        <w:keepNext w:val="0"/>
+      </w:pPr>
+      <w:r>
+        <w:rPr>
+          <w:color w:val="000000"/>
+        </w:rPr>
+        <w:t>Figure 10. Recorded high-resolution AWS demo showing the frozen normal baseline, actual publication status and independently detected consecutive periods. The banking workload is local.</w:t>
+      </w:r>
+    </w:p>
+    <w:p>
+      <w:pPr>
+        <w:keepNext/>
+        <w:pageBreakBefore/>
+        <w:jc w:val="center"/>
+      </w:pPr>
+      <w:r>
+        <w:drawing>
+          <wp:inline xmlns:a="http://schemas.openxmlformats.org/drawingml/2006/main" xmlns:pic="http://schemas.openxmlformats.org/drawingml/2006/picture">
+            <wp:extent cx="4713610" cy="6857999"/>
+            <wp:docPr id="19" name="Picture 19"/>
+            <wp:cNvGraphicFramePr>
+              <a:graphicFrameLocks noChangeAspect="1"/>
+            </wp:cNvGraphicFramePr>
+            <a:graphic>
+              <a:graphicData uri="http://schemas.openxmlformats.org/drawingml/2006/picture">
+                <pic:pic>
+                  <pic:nvPicPr>
+                    <pic:cNvPr id="0" name="demo-readings-followup.jpg"/>
+                    <pic:cNvPicPr/>
+                  </pic:nvPicPr>
+                  <pic:blipFill>
+                    <a:blip r:embed="rId26"/>
+                    <a:stretch>
+                      <a:fillRect/>
+                    </a:stretch>
+                  </pic:blipFill>
+                  <pic:spPr>
+                    <a:xfrm>
+                      <a:off x="0" y="0"/>
+                      <a:ext cx="4713610" cy="6857999"/>
+                    </a:xfrm>
+                    <a:prstGeom prst="rect"/>
+                  </pic:spPr>
+                </pic:pic>
+              </a:graphicData>
+            </a:graphic>
+          </wp:inline>
+        </w:drawing>
+      </w:r>
+    </w:p>
+    <w:p>
+      <w:pPr>
+        <w:pStyle w:val="Caption"/>
+        <w:keepNext w:val="0"/>
+      </w:pPr>
+      <w:r>
+        <w:rPr>
+          <w:color w:val="000000"/>
+        </w:rPr>
+        <w:t>Figure 11. Actual CloudWatch time series, local HTTP/SQL trace corroboration, and measured follow-up readings from the authorized high-resolution demo. Saved readings do not assert a current fault or causal recovery.</w:t>
+      </w:r>
+    </w:p>
+    <w:p>
+      <w:pPr>
         <w:pStyle w:val="Heading2"/>
         <w:pageBreakBefore/>
       </w:pPr>
@@ -8491,7 +8669,7 @@
         <w:rPr>
           <w:color w:val="000000"/>
         </w:rPr>
-        <w:t>The source repository is maintained at https://github.com/Haris757518/ExplainableAI_Cloud_Banking_Cloud_Project_2026. The supplied main checkout references baseline commit 839b52599ff542ed4e04d033b69e5edd282d39a5 (16 October 2026). The AWS telemetry extension was implemented and verified as local working-tree changes on that baseline. Frozen measured results remain independent of runtime databases, credentials, and the bounded CloudWatch verification subset.</w:t>
+        <w:t>The source repository is maintained at https://github.com/Haris757518/ExplainableAI_Cloud_Banking_Cloud_Project_2026. The supplied main checkout references baseline commit 9866df108f8a5e7afbd6a47039e322ce61ddd11e (16 October 2026). The optional high-resolution AWS demo was verified as local working-tree changes on that baseline. Frozen measured results remain independent of runtime databases, credentials, and the bounded CloudWatch verification subset.</w:t>
       </w:r>
     </w:p>
     <w:p>
@@ -9589,7 +9767,7 @@
                 <w:color w:val="000000"/>
                 <w:sz w:val="20"/>
               </w:rPr>
-              <w:t>124 backend tests passed and frontend production build passed; new AWS panel checked in a live browser</w:t>
+              <w:t>143 backend tests passed and frontend production build passed; optional AWS demo checked in a live browser</w:t>
             </w:r>
           </w:p>
         </w:tc>
@@ -9782,6 +9960,79 @@
                 <w:sz w:val="20"/>
               </w:rPr>
               <w:t>Verified live</w:t>
+            </w:r>
+          </w:p>
+        </w:tc>
+      </w:tr>
+      <w:tr>
+        <w:trPr>
+          <w:cantSplit/>
+        </w:trPr>
+        <w:tc>
+          <w:tcPr>
+            <w:tcW w:type="dxa" w:w="648"/>
+          </w:tcPr>
+          <w:p>
+            <w:pPr>
+              <w:spacing w:after="0"/>
+            </w:pPr>
+            <w:r>
+              <w:rPr>
+                <w:color w:val="000000"/>
+                <w:sz w:val="20"/>
+              </w:rPr>
+              <w:t>T12</w:t>
+            </w:r>
+          </w:p>
+        </w:tc>
+        <w:tc>
+          <w:tcPr>
+            <w:tcW w:type="dxa" w:w="2376"/>
+          </w:tcPr>
+          <w:p>
+            <w:pPr>
+              <w:spacing w:after="0"/>
+            </w:pPr>
+            <w:r>
+              <w:rPr>
+                <w:color w:val="000000"/>
+                <w:sz w:val="20"/>
+              </w:rPr>
+              <w:t>High-resolution AWS demo</w:t>
+            </w:r>
+          </w:p>
+        </w:tc>
+        <w:tc>
+          <w:tcPr>
+            <w:tcW w:type="dxa" w:w="4594"/>
+          </w:tcPr>
+          <w:p>
+            <w:pPr>
+              <w:spacing w:after="0"/>
+            </w:pPr>
+            <w:r>
+              <w:rPr>
+                <w:color w:val="000000"/>
+                <w:sz w:val="20"/>
+              </w:rPr>
+              <w:t>60 actual requests; 10-second periods; abnormal_latency_detected</w:t>
+            </w:r>
+          </w:p>
+        </w:tc>
+        <w:tc>
+          <w:tcPr>
+            <w:tcW w:type="dxa" w:w="1886"/>
+          </w:tcPr>
+          <w:p>
+            <w:pPr>
+              <w:spacing w:after="0"/>
+            </w:pPr>
+            <w:r>
+              <w:rPr>
+                <w:color w:val="000000"/>
+                <w:sz w:val="20"/>
+              </w:rPr>
+              <w:t>Measured live</w:t>
             </w:r>
           </w:p>
         </w:tc>
@@ -11859,7 +12110,7 @@
         <w:rPr>
           <w:color w:val="000000"/>
         </w:rPr>
-        <w:t>Source code, benchmark adapters, model definitions, scripts, and immutable experimental results are maintained in the project repository under the MIT license. Historical research artifacts remain available, while credentials, local operational databases, and raw monitored telemetry are excluded. The final review build was published on the main branch as commit 839b525 on 16 October 2026.</w:t>
+        <w:t>Source code, benchmark adapters, model definitions, scripts, and immutable experimental results are maintained in the project repository under the MIT license. Historical research artifacts remain available, while credentials, local operational databases, and raw monitored telemetry are excluded. The AWS integration was published on main as commit 9866df1 on 16 October 2026. The optional demo changes await review and have not been pushed.</w:t>
       </w:r>
     </w:p>
     <w:p>
@@ -11905,10 +12156,7 @@
     </w:p>
     <w:p>
       <w:r>
-        <w:rPr>
-          <w:color w:val="000000"/>
-        </w:rPr>
-        <w:t>The completed academic system connects actual test banking transactions with measured performance telemetry and a sequential root-cause investigation interface. In the frozen three-case application-delay study, the system detected the slowdown, localized the Ledger Service, identified a matching processing-delay hypothesis, and measured return toward the frozen reference. The compatible banking GNN did not establish an advantage over the feature-only predictor. The AWS extension additionally published ten genuine existing banking requests and retrieved their measurements through CloudWatch, with a dedicated dashboard panel and explicit local-workload provenance. CloudWatch storage and display are verified; cloud hosting, generalized cloud anomaly accuracy and causal recovery remain unestablished.</w:t>
+        <w:t>The completed academic system connects actual test banking transactions with measured performance telemetry and a sequential root-cause investigation interface. In the frozen three-case application-delay study, the system detected the slowdown, localized the Ledger Service, identified a matching processing-delay hypothesis, and measured return toward the frozen reference. The compatible banking GNN did not establish an advantage over the feature-only predictor. The AWS extension additionally published ten genuine existing banking requests and retrieved their measurements through CloudWatch, with a dedicated dashboard panel and explicit local-workload provenance. CloudWatch storage and display are verified; cloud hosting, generalized cloud anomaly accuracy and causal recovery remain unestablished. The optional ten-second AWS demonstration additionally detected two consecutive periods of measured application slowdown and recorded subsequent return toward its frozen normal reference. This is a controlled integration result rather than generalized cloud diagnosis accuracy.</w:t>
       </w:r>
     </w:p>
     <w:p>
@@ -11924,10 +12172,7 @@
     </w:p>
     <w:p>
       <w:r>
-        <w:rPr>
-          <w:color w:val="000000"/>
-        </w:rPr>
-        <w:t>Potential subsequent work includes independently instrumented PostgreSQL wait and lock experiments, larger fault-type coverage, held-out cross-machine banking workloads, improved detector calibration, and verified cloud deployment of the banking services. The implemented CloudWatch integration requires longer independently labelled normal and abnormal banking windows before cloud anomaly performance, mechanism identification, or follow-up recovery can be evaluated.</w:t>
+        <w:t>Potential subsequent work includes independently instrumented PostgreSQL wait and lock experiments, larger fault-type coverage, held-out cross-machine banking workloads, improved detector calibration, and verified cloud deployment of the banking services. Beyond the completed controlled ten-second demonstration, larger independently labelled normal and abnormal studies are required to establish generalized cloud anomaly performance, mechanism identification and recovery behavior.</w:t>
       </w:r>
     </w:p>
     <w:p>
@@ -12307,6 +12552,14 @@
         <w:rPr>
           <w:color w:val="000000"/>
         </w:rPr>
+        <w:t>10. AWS high resolution demo: follow docs/AWS_ANOMALY_DEMO.md. Prepare a fresh session, review the limits, and use all three explicit confirmations before running. The completed demonstration is historical evidence; a new run requires a new session and operator approval. Read-only --refresh does not repeat transfers or publication.</w:t>
+      </w:r>
+    </w:p>
+    <w:p>
+      <w:r>
+        <w:rPr>
+          <w:color w:val="000000"/>
+        </w:rPr>
         <w:t>Frozen banking report: results/banking/measured_20261016/report.json; selected by results/banking/FINAL.json. Research artifacts: results/research_v3/ and results/research_v4/. Authoritative project handover: docs/FINAL_HANDOVER.md.</w:t>
       </w:r>
     </w:p>
@@ -12324,10 +12577,7 @@
     </w:p>
     <w:p>
       <w:r>
-        <w:rPr>
-          <w:color w:val="000000"/>
-        </w:rPr>
-        <w:t>Figures 5–8 are saved captures from frontend/test-results in the supplied project; their file-save times are 16 October 2026 at approximately 19:33–19:45 local time. Figure 9 was captured from the updated application after live AWS verification on 16 October 2026 at approximately 21:50 IST. Its collection timestamp and original measurement timestamp are separately displayed. The review server uses an isolated copy of the banking runtime while its publication preview reads the original telemetry database in read-only mode. Screenshots retain actual values and source labels. Crops remove surrounding interface area only.</w:t>
+        <w:t>Figures 5–8 are saved captures from frontend/test-results in the supplied project; their file-save times are 16 October 2026 at approximately 19:33–19:45 local time. Figure 9 was captured from the updated application after live AWS verification on 16 October 2026 at approximately 21:50 IST. Its collection timestamp and original measurement timestamp are separately displayed. The review server uses an isolated copy of the banking runtime while its publication preview reads the original telemetry database in read-only mode. Screenshots retain actual values and source labels. Crops remove surrounding interface area only. Figures 10–11 were captured from the optional AWS demo section after the completed session; their displayed baseline, series and follow-up values are actual recorded observations.</w:t>
       </w:r>
     </w:p>
     <w:tbl>
@@ -12678,6 +12928,66 @@
                 <w:sz w:val="21"/>
               </w:rPr>
               <w:t>cloudwatch-banking-live.jpg; new live banking CloudWatch panel capture, cropped to publication and latency evidence</w:t>
+            </w:r>
+          </w:p>
+        </w:tc>
+      </w:tr>
+      <w:tr>
+        <w:tc>
+          <w:tcPr>
+            <w:tcW w:type="dxa" w:w="1584"/>
+          </w:tcPr>
+          <w:p>
+            <w:r>
+              <w:rPr>
+                <w:color w:val="000000"/>
+                <w:sz w:val="21"/>
+              </w:rPr>
+              <w:t>Figure 10</w:t>
+            </w:r>
+          </w:p>
+        </w:tc>
+        <w:tc>
+          <w:tcPr>
+            <w:tcW w:type="dxa" w:w="7920"/>
+          </w:tcPr>
+          <w:p>
+            <w:r>
+              <w:rPr>
+                <w:color w:val="000000"/>
+                <w:sz w:val="21"/>
+              </w:rPr>
+              <w:t>demo-baseline-detection.jpg; actual high-resolution demonstration panel capture</w:t>
+            </w:r>
+          </w:p>
+        </w:tc>
+      </w:tr>
+      <w:tr>
+        <w:tc>
+          <w:tcPr>
+            <w:tcW w:type="dxa" w:w="1584"/>
+          </w:tcPr>
+          <w:p>
+            <w:r>
+              <w:rPr>
+                <w:color w:val="000000"/>
+                <w:sz w:val="21"/>
+              </w:rPr>
+              <w:t>Figure 11</w:t>
+            </w:r>
+          </w:p>
+        </w:tc>
+        <w:tc>
+          <w:tcPr>
+            <w:tcW w:type="dxa" w:w="7920"/>
+          </w:tcPr>
+          <w:p>
+            <w:r>
+              <w:rPr>
+                <w:color w:val="000000"/>
+                <w:sz w:val="21"/>
+              </w:rPr>
+              <w:t>demo-readings-followup.jpg; actual high-resolution demonstration panel capture</w:t>
             </w:r>
           </w:p>
         </w:tc>

</xml_diff>

<commit_message>
Finalize report repository references screenshots and test statuses
</commit_message>
<xml_diff>
--- a/docs/Digital_Banking_Cloud_Project_Final_Report.docx
+++ b/docs/Digital_Banking_Cloud_Project_Final_Report.docx
@@ -8248,7 +8248,7 @@
         <w:rPr>
           <w:color w:val="000000"/>
         </w:rPr>
-        <w:t>Figures 5–8 reproduce saved banking application captures supplied with the project. Figure 9 is a new capture of the implemented Cloud Monitoring panel after successful publication and retrieval of actual banking measurements. Crops retain original displayed measurements and source labels. Interface screenshots are not additional cases in the frozen three-repetition local study.</w:t>
+        <w:t>Figures 5–11 present seven screenshots of the implemented banking application and AWS integration. Figures 5–8 reproduce saved banking application captures. Figure 9 shows the Cloud Monitoring panel after publication and retrieval of actual banking measurements. Figures 10–11 show the completed high-resolution AWS experiment: its frozen normal reference, detected abnormal periods, measured service timings, and subsequent readings. Crops retain displayed measurements and source labels. These screenshots do not add cases to the frozen three-repetition local study.</w:t>
       </w:r>
     </w:p>
     <w:p>
@@ -8669,7 +8669,7 @@
         <w:rPr>
           <w:color w:val="000000"/>
         </w:rPr>
-        <w:t>The source repository is maintained at https://github.com/Haris757518/ExplainableAI_Cloud_Banking_Cloud_Project_2026. The supplied main checkout references baseline commit 9866df108f8a5e7afbd6a47039e322ce61ddd11e (16 October 2026). The optional high-resolution AWS demo was verified as local working-tree changes on that baseline. Frozen measured results remain independent of runtime databases, credentials, and the bounded CloudWatch verification subset.</w:t>
+        <w:t>The source repository is maintained at https://github.com/Haris757518/ExplainableAI_Cloud_Banking_Cloud_Project_2026. Commit 9866df1 introduced the standard AWS integration; commit 1374b0f added the verified high-resolution experiment, dashboard, measured evidence, and report on main on 16 October 2026. Frozen research results remain separate from runtime data and the bounded CloudWatch experiments.</w:t>
       </w:r>
     </w:p>
     <w:p>
@@ -8737,12 +8737,14 @@
               <w:left w:w="70" w:type="dxa"/>
               <w:right w:w="70" w:type="dxa"/>
             </w:tcMar>
-            <w:vAlign w:val="top"/>
+            <w:vAlign w:val="center"/>
           </w:tcPr>
           <w:p>
             <w:pPr>
               <w:pStyle w:val="TableText"/>
               <w:keepNext/>
+              <w:spacing w:before="40" w:after="40"/>
+              <w:jc w:val="center"/>
             </w:pPr>
             <w:r>
               <w:rPr>
@@ -8764,12 +8766,14 @@
               <w:left w:w="70" w:type="dxa"/>
               <w:right w:w="70" w:type="dxa"/>
             </w:tcMar>
-            <w:vAlign w:val="top"/>
+            <w:vAlign w:val="center"/>
           </w:tcPr>
           <w:p>
             <w:pPr>
               <w:pStyle w:val="TableText"/>
               <w:keepNext/>
+              <w:spacing w:before="40" w:after="40"/>
+              <w:jc w:val="left"/>
             </w:pPr>
             <w:r>
               <w:rPr>
@@ -8791,12 +8795,14 @@
               <w:left w:w="70" w:type="dxa"/>
               <w:right w:w="70" w:type="dxa"/>
             </w:tcMar>
-            <w:vAlign w:val="top"/>
+            <w:vAlign w:val="center"/>
           </w:tcPr>
           <w:p>
             <w:pPr>
               <w:pStyle w:val="TableText"/>
               <w:keepNext/>
+              <w:spacing w:before="40" w:after="40"/>
+              <w:jc w:val="left"/>
             </w:pPr>
             <w:r>
               <w:rPr>
@@ -8818,12 +8824,14 @@
               <w:left w:w="70" w:type="dxa"/>
               <w:right w:w="70" w:type="dxa"/>
             </w:tcMar>
-            <w:vAlign w:val="top"/>
+            <w:vAlign w:val="center"/>
           </w:tcPr>
           <w:p>
             <w:pPr>
               <w:pStyle w:val="TableText"/>
               <w:keepNext/>
+              <w:spacing w:before="40" w:after="40"/>
+              <w:jc w:val="center"/>
             </w:pPr>
             <w:r>
               <w:rPr>
@@ -8843,7 +8851,7 @@
         <w:tc>
           <w:tcPr>
             <w:tcW w:type="dxa" w:w="648"/>
-            <w:vAlign w:val="top"/>
+            <w:vAlign w:val="center"/>
             <w:tcMar>
               <w:top w:w="70" w:type="dxa"/>
               <w:bottom w:w="70" w:type="dxa"/>
@@ -8855,6 +8863,8 @@
             <w:pPr>
               <w:pStyle w:val="TableText"/>
               <w:keepLines/>
+              <w:spacing w:before="40" w:after="40"/>
+              <w:jc w:val="center"/>
             </w:pPr>
             <w:r>
               <w:rPr>
@@ -8868,7 +8878,7 @@
         <w:tc>
           <w:tcPr>
             <w:tcW w:type="dxa" w:w="2376"/>
-            <w:vAlign w:val="top"/>
+            <w:vAlign w:val="center"/>
             <w:tcMar>
               <w:top w:w="70" w:type="dxa"/>
               <w:bottom w:w="70" w:type="dxa"/>
@@ -8880,6 +8890,8 @@
             <w:pPr>
               <w:pStyle w:val="TableText"/>
               <w:keepLines/>
+              <w:spacing w:before="40" w:after="40"/>
+              <w:jc w:val="left"/>
             </w:pPr>
             <w:r>
               <w:rPr>
@@ -8893,7 +8905,7 @@
         <w:tc>
           <w:tcPr>
             <w:tcW w:type="dxa" w:w="4594"/>
-            <w:vAlign w:val="top"/>
+            <w:vAlign w:val="center"/>
             <w:tcMar>
               <w:top w:w="70" w:type="dxa"/>
               <w:bottom w:w="70" w:type="dxa"/>
@@ -8905,6 +8917,8 @@
             <w:pPr>
               <w:pStyle w:val="TableText"/>
               <w:keepLines/>
+              <w:spacing w:before="40" w:after="40"/>
+              <w:jc w:val="left"/>
             </w:pPr>
             <w:r>
               <w:rPr>
@@ -8918,7 +8932,7 @@
         <w:tc>
           <w:tcPr>
             <w:tcW w:type="dxa" w:w="1886"/>
-            <w:vAlign w:val="top"/>
+            <w:vAlign w:val="center"/>
             <w:tcMar>
               <w:top w:w="70" w:type="dxa"/>
               <w:bottom w:w="70" w:type="dxa"/>
@@ -8930,6 +8944,8 @@
             <w:pPr>
               <w:pStyle w:val="TableText"/>
               <w:keepLines/>
+              <w:spacing w:before="40" w:after="40"/>
+              <w:jc w:val="center"/>
             </w:pPr>
             <w:r>
               <w:rPr>
@@ -8948,7 +8964,7 @@
         <w:tc>
           <w:tcPr>
             <w:tcW w:type="dxa" w:w="648"/>
-            <w:vAlign w:val="top"/>
+            <w:vAlign w:val="center"/>
             <w:shd w:fill="FAFAFA"/>
             <w:tcMar>
               <w:top w:w="70" w:type="dxa"/>
@@ -8961,6 +8977,8 @@
             <w:pPr>
               <w:pStyle w:val="TableText"/>
               <w:keepLines/>
+              <w:spacing w:before="40" w:after="40"/>
+              <w:jc w:val="center"/>
             </w:pPr>
             <w:r>
               <w:rPr>
@@ -8974,7 +8992,7 @@
         <w:tc>
           <w:tcPr>
             <w:tcW w:type="dxa" w:w="2376"/>
-            <w:vAlign w:val="top"/>
+            <w:vAlign w:val="center"/>
             <w:shd w:fill="FAFAFA"/>
             <w:tcMar>
               <w:top w:w="70" w:type="dxa"/>
@@ -8987,6 +9005,8 @@
             <w:pPr>
               <w:pStyle w:val="TableText"/>
               <w:keepLines/>
+              <w:spacing w:before="40" w:after="40"/>
+              <w:jc w:val="left"/>
             </w:pPr>
             <w:r>
               <w:rPr>
@@ -9000,7 +9020,7 @@
         <w:tc>
           <w:tcPr>
             <w:tcW w:type="dxa" w:w="4594"/>
-            <w:vAlign w:val="top"/>
+            <w:vAlign w:val="center"/>
             <w:shd w:fill="FAFAFA"/>
             <w:tcMar>
               <w:top w:w="70" w:type="dxa"/>
@@ -9013,6 +9033,8 @@
             <w:pPr>
               <w:pStyle w:val="TableText"/>
               <w:keepLines/>
+              <w:spacing w:before="40" w:after="40"/>
+              <w:jc w:val="left"/>
             </w:pPr>
             <w:r>
               <w:rPr>
@@ -9026,7 +9048,7 @@
         <w:tc>
           <w:tcPr>
             <w:tcW w:type="dxa" w:w="1886"/>
-            <w:vAlign w:val="top"/>
+            <w:vAlign w:val="center"/>
             <w:shd w:fill="FAFAFA"/>
             <w:tcMar>
               <w:top w:w="70" w:type="dxa"/>
@@ -9039,6 +9061,8 @@
             <w:pPr>
               <w:pStyle w:val="TableText"/>
               <w:keepLines/>
+              <w:spacing w:before="40" w:after="40"/>
+              <w:jc w:val="center"/>
             </w:pPr>
             <w:r>
               <w:rPr>
@@ -9057,7 +9081,7 @@
         <w:tc>
           <w:tcPr>
             <w:tcW w:type="dxa" w:w="648"/>
-            <w:vAlign w:val="top"/>
+            <w:vAlign w:val="center"/>
             <w:tcMar>
               <w:top w:w="70" w:type="dxa"/>
               <w:bottom w:w="70" w:type="dxa"/>
@@ -9069,6 +9093,8 @@
             <w:pPr>
               <w:pStyle w:val="TableText"/>
               <w:keepLines/>
+              <w:spacing w:before="40" w:after="40"/>
+              <w:jc w:val="center"/>
             </w:pPr>
             <w:r>
               <w:rPr>
@@ -9082,7 +9108,7 @@
         <w:tc>
           <w:tcPr>
             <w:tcW w:type="dxa" w:w="2376"/>
-            <w:vAlign w:val="top"/>
+            <w:vAlign w:val="center"/>
             <w:tcMar>
               <w:top w:w="70" w:type="dxa"/>
               <w:bottom w:w="70" w:type="dxa"/>
@@ -9094,6 +9120,8 @@
             <w:pPr>
               <w:pStyle w:val="TableText"/>
               <w:keepLines/>
+              <w:spacing w:before="40" w:after="40"/>
+              <w:jc w:val="left"/>
             </w:pPr>
             <w:r>
               <w:rPr>
@@ -9107,7 +9135,7 @@
         <w:tc>
           <w:tcPr>
             <w:tcW w:type="dxa" w:w="4594"/>
-            <w:vAlign w:val="top"/>
+            <w:vAlign w:val="center"/>
             <w:tcMar>
               <w:top w:w="70" w:type="dxa"/>
               <w:bottom w:w="70" w:type="dxa"/>
@@ -9119,6 +9147,8 @@
             <w:pPr>
               <w:pStyle w:val="TableText"/>
               <w:keepLines/>
+              <w:spacing w:before="40" w:after="40"/>
+              <w:jc w:val="left"/>
             </w:pPr>
             <w:r>
               <w:rPr>
@@ -9132,7 +9162,7 @@
         <w:tc>
           <w:tcPr>
             <w:tcW w:type="dxa" w:w="1886"/>
-            <w:vAlign w:val="top"/>
+            <w:vAlign w:val="center"/>
             <w:tcMar>
               <w:top w:w="70" w:type="dxa"/>
               <w:bottom w:w="70" w:type="dxa"/>
@@ -9144,6 +9174,8 @@
             <w:pPr>
               <w:pStyle w:val="TableText"/>
               <w:keepLines/>
+              <w:spacing w:before="40" w:after="40"/>
+              <w:jc w:val="center"/>
             </w:pPr>
             <w:r>
               <w:rPr>
@@ -9162,7 +9194,7 @@
         <w:tc>
           <w:tcPr>
             <w:tcW w:type="dxa" w:w="648"/>
-            <w:vAlign w:val="top"/>
+            <w:vAlign w:val="center"/>
             <w:shd w:fill="FAFAFA"/>
             <w:tcMar>
               <w:top w:w="70" w:type="dxa"/>
@@ -9175,6 +9207,8 @@
             <w:pPr>
               <w:pStyle w:val="TableText"/>
               <w:keepLines/>
+              <w:spacing w:before="40" w:after="40"/>
+              <w:jc w:val="center"/>
             </w:pPr>
             <w:r>
               <w:rPr>
@@ -9188,7 +9222,7 @@
         <w:tc>
           <w:tcPr>
             <w:tcW w:type="dxa" w:w="2376"/>
-            <w:vAlign w:val="top"/>
+            <w:vAlign w:val="center"/>
             <w:shd w:fill="FAFAFA"/>
             <w:tcMar>
               <w:top w:w="70" w:type="dxa"/>
@@ -9201,6 +9235,8 @@
             <w:pPr>
               <w:pStyle w:val="TableText"/>
               <w:keepLines/>
+              <w:spacing w:before="40" w:after="40"/>
+              <w:jc w:val="left"/>
             </w:pPr>
             <w:r>
               <w:rPr>
@@ -9214,7 +9250,7 @@
         <w:tc>
           <w:tcPr>
             <w:tcW w:type="dxa" w:w="4594"/>
-            <w:vAlign w:val="top"/>
+            <w:vAlign w:val="center"/>
             <w:shd w:fill="FAFAFA"/>
             <w:tcMar>
               <w:top w:w="70" w:type="dxa"/>
@@ -9227,6 +9263,8 @@
             <w:pPr>
               <w:pStyle w:val="TableText"/>
               <w:keepLines/>
+              <w:spacing w:before="40" w:after="40"/>
+              <w:jc w:val="left"/>
             </w:pPr>
             <w:r>
               <w:rPr>
@@ -9240,7 +9278,7 @@
         <w:tc>
           <w:tcPr>
             <w:tcW w:type="dxa" w:w="1886"/>
-            <w:vAlign w:val="top"/>
+            <w:vAlign w:val="center"/>
             <w:shd w:fill="FAFAFA"/>
             <w:tcMar>
               <w:top w:w="70" w:type="dxa"/>
@@ -9253,6 +9291,8 @@
             <w:pPr>
               <w:pStyle w:val="TableText"/>
               <w:keepLines/>
+              <w:spacing w:before="40" w:after="40"/>
+              <w:jc w:val="center"/>
             </w:pPr>
             <w:r>
               <w:rPr>
@@ -9271,7 +9311,7 @@
         <w:tc>
           <w:tcPr>
             <w:tcW w:type="dxa" w:w="648"/>
-            <w:vAlign w:val="top"/>
+            <w:vAlign w:val="center"/>
             <w:tcMar>
               <w:top w:w="70" w:type="dxa"/>
               <w:bottom w:w="70" w:type="dxa"/>
@@ -9283,6 +9323,8 @@
             <w:pPr>
               <w:pStyle w:val="TableText"/>
               <w:keepLines/>
+              <w:spacing w:before="40" w:after="40"/>
+              <w:jc w:val="center"/>
             </w:pPr>
             <w:r>
               <w:rPr>
@@ -9296,7 +9338,7 @@
         <w:tc>
           <w:tcPr>
             <w:tcW w:type="dxa" w:w="2376"/>
-            <w:vAlign w:val="top"/>
+            <w:vAlign w:val="center"/>
             <w:tcMar>
               <w:top w:w="70" w:type="dxa"/>
               <w:bottom w:w="70" w:type="dxa"/>
@@ -9308,6 +9350,8 @@
             <w:pPr>
               <w:pStyle w:val="TableText"/>
               <w:keepLines/>
+              <w:spacing w:before="40" w:after="40"/>
+              <w:jc w:val="left"/>
             </w:pPr>
             <w:r>
               <w:rPr>
@@ -9321,7 +9365,7 @@
         <w:tc>
           <w:tcPr>
             <w:tcW w:type="dxa" w:w="4594"/>
-            <w:vAlign w:val="top"/>
+            <w:vAlign w:val="center"/>
             <w:tcMar>
               <w:top w:w="70" w:type="dxa"/>
               <w:bottom w:w="70" w:type="dxa"/>
@@ -9333,6 +9377,8 @@
             <w:pPr>
               <w:pStyle w:val="TableText"/>
               <w:keepLines/>
+              <w:spacing w:before="40" w:after="40"/>
+              <w:jc w:val="left"/>
             </w:pPr>
             <w:r>
               <w:rPr>
@@ -9346,7 +9392,7 @@
         <w:tc>
           <w:tcPr>
             <w:tcW w:type="dxa" w:w="1886"/>
-            <w:vAlign w:val="top"/>
+            <w:vAlign w:val="center"/>
             <w:tcMar>
               <w:top w:w="70" w:type="dxa"/>
               <w:bottom w:w="70" w:type="dxa"/>
@@ -9358,6 +9404,8 @@
             <w:pPr>
               <w:pStyle w:val="TableText"/>
               <w:keepLines/>
+              <w:spacing w:before="40" w:after="40"/>
+              <w:jc w:val="center"/>
             </w:pPr>
             <w:r>
               <w:rPr>
@@ -9376,7 +9424,7 @@
         <w:tc>
           <w:tcPr>
             <w:tcW w:type="dxa" w:w="648"/>
-            <w:vAlign w:val="top"/>
+            <w:vAlign w:val="center"/>
             <w:shd w:fill="FAFAFA"/>
             <w:tcMar>
               <w:top w:w="70" w:type="dxa"/>
@@ -9389,6 +9437,8 @@
             <w:pPr>
               <w:pStyle w:val="TableText"/>
               <w:keepLines/>
+              <w:spacing w:before="40" w:after="40"/>
+              <w:jc w:val="center"/>
             </w:pPr>
             <w:r>
               <w:rPr>
@@ -9402,7 +9452,7 @@
         <w:tc>
           <w:tcPr>
             <w:tcW w:type="dxa" w:w="2376"/>
-            <w:vAlign w:val="top"/>
+            <w:vAlign w:val="center"/>
             <w:shd w:fill="FAFAFA"/>
             <w:tcMar>
               <w:top w:w="70" w:type="dxa"/>
@@ -9415,6 +9465,8 @@
             <w:pPr>
               <w:pStyle w:val="TableText"/>
               <w:keepLines/>
+              <w:spacing w:before="40" w:after="40"/>
+              <w:jc w:val="left"/>
             </w:pPr>
             <w:r>
               <w:rPr>
@@ -9428,7 +9480,7 @@
         <w:tc>
           <w:tcPr>
             <w:tcW w:type="dxa" w:w="4594"/>
-            <w:vAlign w:val="top"/>
+            <w:vAlign w:val="center"/>
             <w:shd w:fill="FAFAFA"/>
             <w:tcMar>
               <w:top w:w="70" w:type="dxa"/>
@@ -9441,20 +9493,22 @@
             <w:pPr>
               <w:pStyle w:val="TableText"/>
               <w:keepLines/>
+              <w:spacing w:before="40" w:after="40"/>
+              <w:jc w:val="left"/>
             </w:pPr>
             <w:r>
               <w:rPr>
                 <w:color w:val="000000"/>
                 <w:sz w:val="20"/>
               </w:rPr>
-              <w:t>3 of 3 detections and service/mechanism matches</w:t>
+              <w:t>3/3 detections with matching service and mechanism annotations</w:t>
             </w:r>
           </w:p>
         </w:tc>
         <w:tc>
           <w:tcPr>
             <w:tcW w:type="dxa" w:w="1886"/>
-            <w:vAlign w:val="top"/>
+            <w:vAlign w:val="center"/>
             <w:shd w:fill="FAFAFA"/>
             <w:tcMar>
               <w:top w:w="70" w:type="dxa"/>
@@ -9467,13 +9521,15 @@
             <w:pPr>
               <w:pStyle w:val="TableText"/>
               <w:keepLines/>
+              <w:spacing w:before="40" w:after="40"/>
+              <w:jc w:val="center"/>
             </w:pPr>
             <w:r>
               <w:rPr>
                 <w:color w:val="000000"/>
                 <w:sz w:val="20"/>
               </w:rPr>
-              <w:t>Passed within study</w:t>
+              <w:t>Verified in study</w:t>
             </w:r>
           </w:p>
         </w:tc>
@@ -9485,7 +9541,7 @@
         <w:tc>
           <w:tcPr>
             <w:tcW w:type="dxa" w:w="648"/>
-            <w:vAlign w:val="top"/>
+            <w:vAlign w:val="center"/>
             <w:tcMar>
               <w:top w:w="70" w:type="dxa"/>
               <w:bottom w:w="70" w:type="dxa"/>
@@ -9497,6 +9553,8 @@
             <w:pPr>
               <w:pStyle w:val="TableText"/>
               <w:keepLines/>
+              <w:spacing w:before="40" w:after="40"/>
+              <w:jc w:val="center"/>
             </w:pPr>
             <w:r>
               <w:rPr>
@@ -9510,7 +9568,7 @@
         <w:tc>
           <w:tcPr>
             <w:tcW w:type="dxa" w:w="2376"/>
-            <w:vAlign w:val="top"/>
+            <w:vAlign w:val="center"/>
             <w:tcMar>
               <w:top w:w="70" w:type="dxa"/>
               <w:bottom w:w="70" w:type="dxa"/>
@@ -9522,6 +9580,8 @@
             <w:pPr>
               <w:pStyle w:val="TableText"/>
               <w:keepLines/>
+              <w:spacing w:before="40" w:after="40"/>
+              <w:jc w:val="left"/>
             </w:pPr>
             <w:r>
               <w:rPr>
@@ -9535,7 +9595,7 @@
         <w:tc>
           <w:tcPr>
             <w:tcW w:type="dxa" w:w="4594"/>
-            <w:vAlign w:val="top"/>
+            <w:vAlign w:val="center"/>
             <w:tcMar>
               <w:top w:w="70" w:type="dxa"/>
               <w:bottom w:w="70" w:type="dxa"/>
@@ -9547,20 +9607,22 @@
             <w:pPr>
               <w:pStyle w:val="TableText"/>
               <w:keepLines/>
+              <w:spacing w:before="40" w:after="40"/>
+              <w:jc w:val="left"/>
             </w:pPr>
             <w:r>
               <w:rPr>
                 <w:color w:val="000000"/>
                 <w:sz w:val="20"/>
               </w:rPr>
-              <w:t>Both predictors trained/evaluated; no graph advantage</w:t>
+              <w:t>Both predictors evaluated; no graph advantage established</w:t>
             </w:r>
           </w:p>
         </w:tc>
         <w:tc>
           <w:tcPr>
             <w:tcW w:type="dxa" w:w="1886"/>
-            <w:vAlign w:val="top"/>
+            <w:vAlign w:val="center"/>
             <w:tcMar>
               <w:top w:w="70" w:type="dxa"/>
               <w:bottom w:w="70" w:type="dxa"/>
@@ -9572,6 +9634,8 @@
             <w:pPr>
               <w:pStyle w:val="TableText"/>
               <w:keepLines/>
+              <w:spacing w:before="40" w:after="40"/>
+              <w:jc w:val="center"/>
             </w:pPr>
             <w:r>
               <w:rPr>
@@ -9590,7 +9654,7 @@
         <w:tc>
           <w:tcPr>
             <w:tcW w:type="dxa" w:w="648"/>
-            <w:vAlign w:val="top"/>
+            <w:vAlign w:val="center"/>
             <w:shd w:fill="FAFAFA"/>
             <w:tcMar>
               <w:top w:w="70" w:type="dxa"/>
@@ -9603,6 +9667,8 @@
             <w:pPr>
               <w:pStyle w:val="TableText"/>
               <w:keepLines/>
+              <w:spacing w:before="40" w:after="40"/>
+              <w:jc w:val="center"/>
             </w:pPr>
             <w:r>
               <w:rPr>
@@ -9616,7 +9682,7 @@
         <w:tc>
           <w:tcPr>
             <w:tcW w:type="dxa" w:w="2376"/>
-            <w:vAlign w:val="top"/>
+            <w:vAlign w:val="center"/>
             <w:shd w:fill="FAFAFA"/>
             <w:tcMar>
               <w:top w:w="70" w:type="dxa"/>
@@ -9629,6 +9695,8 @@
             <w:pPr>
               <w:pStyle w:val="TableText"/>
               <w:keepLines/>
+              <w:spacing w:before="40" w:after="40"/>
+              <w:jc w:val="left"/>
             </w:pPr>
             <w:r>
               <w:rPr>
@@ -9642,7 +9710,7 @@
         <w:tc>
           <w:tcPr>
             <w:tcW w:type="dxa" w:w="4594"/>
-            <w:vAlign w:val="top"/>
+            <w:vAlign w:val="center"/>
             <w:shd w:fill="FAFAFA"/>
             <w:tcMar>
               <w:top w:w="70" w:type="dxa"/>
@@ -9655,6 +9723,8 @@
             <w:pPr>
               <w:pStyle w:val="TableText"/>
               <w:keepLines/>
+              <w:spacing w:before="40" w:after="40"/>
+              <w:jc w:val="left"/>
             </w:pPr>
             <w:r>
               <w:rPr>
@@ -9668,7 +9738,7 @@
         <w:tc>
           <w:tcPr>
             <w:tcW w:type="dxa" w:w="1886"/>
-            <w:vAlign w:val="top"/>
+            <w:vAlign w:val="center"/>
             <w:shd w:fill="FAFAFA"/>
             <w:tcMar>
               <w:top w:w="70" w:type="dxa"/>
@@ -9681,6 +9751,8 @@
             <w:pPr>
               <w:pStyle w:val="TableText"/>
               <w:keepLines/>
+              <w:spacing w:before="40" w:after="40"/>
+              <w:jc w:val="center"/>
             </w:pPr>
             <w:r>
               <w:rPr>
@@ -9699,7 +9771,7 @@
         <w:tc>
           <w:tcPr>
             <w:tcW w:type="dxa" w:w="648"/>
-            <w:vAlign w:val="top"/>
+            <w:vAlign w:val="center"/>
             <w:tcMar>
               <w:top w:w="70" w:type="dxa"/>
               <w:bottom w:w="70" w:type="dxa"/>
@@ -9711,6 +9783,8 @@
             <w:pPr>
               <w:pStyle w:val="TableText"/>
               <w:keepLines/>
+              <w:spacing w:before="40" w:after="40"/>
+              <w:jc w:val="center"/>
             </w:pPr>
             <w:r>
               <w:rPr>
@@ -9724,7 +9798,7 @@
         <w:tc>
           <w:tcPr>
             <w:tcW w:type="dxa" w:w="2376"/>
-            <w:vAlign w:val="top"/>
+            <w:vAlign w:val="center"/>
             <w:tcMar>
               <w:top w:w="70" w:type="dxa"/>
               <w:bottom w:w="70" w:type="dxa"/>
@@ -9736,20 +9810,22 @@
             <w:pPr>
               <w:pStyle w:val="TableText"/>
               <w:keepLines/>
+              <w:spacing w:before="40" w:after="40"/>
+              <w:jc w:val="left"/>
             </w:pPr>
             <w:r>
               <w:rPr>
                 <w:color w:val="000000"/>
                 <w:sz w:val="20"/>
               </w:rPr>
-              <w:t>Frontend/backend regression</w:t>
+              <w:t>Backend and frontend checks</w:t>
             </w:r>
           </w:p>
         </w:tc>
         <w:tc>
           <w:tcPr>
             <w:tcW w:type="dxa" w:w="4594"/>
-            <w:vAlign w:val="top"/>
+            <w:vAlign w:val="center"/>
             <w:tcMar>
               <w:top w:w="70" w:type="dxa"/>
               <w:bottom w:w="70" w:type="dxa"/>
@@ -9761,20 +9837,22 @@
             <w:pPr>
               <w:pStyle w:val="TableText"/>
               <w:keepLines/>
+              <w:spacing w:before="40" w:after="40"/>
+              <w:jc w:val="left"/>
             </w:pPr>
             <w:r>
               <w:rPr>
                 <w:color w:val="000000"/>
                 <w:sz w:val="20"/>
               </w:rPr>
-              <w:t>143 backend tests passed and frontend production build passed; optional AWS demo checked in a live browser</w:t>
+              <w:t>143 backend tests and production build passed; AWS panel reviewed. Earlier 16 browser tests are historical.</w:t>
             </w:r>
           </w:p>
         </w:tc>
         <w:tc>
           <w:tcPr>
             <w:tcW w:type="dxa" w:w="1886"/>
-            <w:vAlign w:val="top"/>
+            <w:vAlign w:val="center"/>
             <w:tcMar>
               <w:top w:w="70" w:type="dxa"/>
               <w:bottom w:w="70" w:type="dxa"/>
@@ -9786,13 +9864,15 @@
             <w:pPr>
               <w:pStyle w:val="TableText"/>
               <w:keepLines/>
+              <w:spacing w:before="40" w:after="40"/>
+              <w:jc w:val="center"/>
             </w:pPr>
             <w:r>
               <w:rPr>
                 <w:color w:val="000000"/>
                 <w:sz w:val="20"/>
               </w:rPr>
-              <w:t>Passed; earlier 16 browser tests remain historical</w:t>
+              <w:t>Passed</w:t>
             </w:r>
           </w:p>
         </w:tc>
@@ -9804,7 +9884,7 @@
         <w:tc>
           <w:tcPr>
             <w:tcW w:type="dxa" w:w="648"/>
-            <w:vAlign w:val="top"/>
+            <w:vAlign w:val="center"/>
             <w:shd w:fill="FAFAFA"/>
             <w:tcMar>
               <w:top w:w="70" w:type="dxa"/>
@@ -9817,6 +9897,8 @@
             <w:pPr>
               <w:pStyle w:val="TableText"/>
               <w:keepLines/>
+              <w:spacing w:before="40" w:after="40"/>
+              <w:jc w:val="center"/>
             </w:pPr>
             <w:r>
               <w:rPr>
@@ -9830,7 +9912,7 @@
         <w:tc>
           <w:tcPr>
             <w:tcW w:type="dxa" w:w="2376"/>
-            <w:vAlign w:val="top"/>
+            <w:vAlign w:val="center"/>
             <w:shd w:fill="FAFAFA"/>
             <w:tcMar>
               <w:top w:w="70" w:type="dxa"/>
@@ -9843,20 +9925,22 @@
             <w:pPr>
               <w:pStyle w:val="TableText"/>
               <w:keepLines/>
+              <w:spacing w:before="40" w:after="40"/>
+              <w:jc w:val="left"/>
             </w:pPr>
             <w:r>
               <w:rPr>
                 <w:color w:val="000000"/>
                 <w:sz w:val="20"/>
               </w:rPr>
-              <w:t>Live cloud fault/recovery</w:t>
+              <w:t>AWS-hosted fault and recovery</w:t>
             </w:r>
           </w:p>
         </w:tc>
         <w:tc>
           <w:tcPr>
             <w:tcW w:type="dxa" w:w="4594"/>
-            <w:vAlign w:val="top"/>
+            <w:vAlign w:val="center"/>
             <w:shd w:fill="FAFAFA"/>
             <w:tcMar>
               <w:top w:w="70" w:type="dxa"/>
@@ -9869,20 +9953,22 @@
             <w:pPr>
               <w:pStyle w:val="TableText"/>
               <w:keepLines/>
+              <w:spacing w:before="40" w:after="40"/>
+              <w:jc w:val="left"/>
             </w:pPr>
             <w:r>
               <w:rPr>
                 <w:color w:val="000000"/>
                 <w:sz w:val="20"/>
               </w:rPr>
-              <w:t>Not performed within final measured study</w:t>
+              <w:t>Banking services ran locally; AWS-hosted fault recovery was not tested</w:t>
             </w:r>
           </w:p>
         </w:tc>
         <w:tc>
           <w:tcPr>
             <w:tcW w:type="dxa" w:w="1886"/>
-            <w:vAlign w:val="top"/>
+            <w:vAlign w:val="center"/>
             <w:shd w:fill="FAFAFA"/>
             <w:tcMar>
               <w:top w:w="70" w:type="dxa"/>
@@ -9895,13 +9981,15 @@
             <w:pPr>
               <w:pStyle w:val="TableText"/>
               <w:keepLines/>
+              <w:spacing w:before="40" w:after="40"/>
+              <w:jc w:val="center"/>
             </w:pPr>
             <w:r>
               <w:rPr>
                 <w:color w:val="000000"/>
                 <w:sz w:val="20"/>
               </w:rPr>
-              <w:t>Not validated</w:t>
+              <w:t>Not tested</w:t>
             </w:r>
           </w:p>
         </w:tc>
@@ -9910,8 +9998,13 @@
         <w:tc>
           <w:tcPr>
             <w:tcW w:type="dxa" w:w="648"/>
+            <w:vAlign w:val="center"/>
           </w:tcPr>
           <w:p>
+            <w:pPr>
+              <w:spacing w:before="40" w:after="40"/>
+              <w:jc w:val="center"/>
+            </w:pPr>
             <w:r>
               <w:rPr>
                 <w:color w:val="000000"/>
@@ -9924,36 +10017,51 @@
         <w:tc>
           <w:tcPr>
             <w:tcW w:type="dxa" w:w="2376"/>
+            <w:vAlign w:val="center"/>
           </w:tcPr>
           <w:p>
+            <w:pPr>
+              <w:spacing w:before="40" w:after="40"/>
+              <w:jc w:val="left"/>
+            </w:pPr>
             <w:r>
               <w:rPr>
                 <w:color w:val="000000"/>
                 <w:sz w:val="20"/>
               </w:rPr>
-              <w:t>AWS banking telemetry</w:t>
+              <w:t>Standard AWS telemetry</w:t>
             </w:r>
           </w:p>
         </w:tc>
         <w:tc>
           <w:tcPr>
             <w:tcW w:type="dxa" w:w="4594"/>
+            <w:vAlign w:val="center"/>
           </w:tcPr>
           <w:p>
+            <w:pPr>
+              <w:spacing w:before="40" w:after="40"/>
+              <w:jc w:val="left"/>
+            </w:pPr>
             <w:r>
               <w:rPr>
                 <w:color w:val="000000"/>
                 <w:sz w:val="20"/>
               </w:rPr>
-              <w:t>10 existing requests; 118 values; 30 CloudWatch series; counts 4/3/3</w:t>
+              <w:t>10 requests; 118 metric values; 30 CloudWatch series</w:t>
             </w:r>
           </w:p>
         </w:tc>
         <w:tc>
           <w:tcPr>
             <w:tcW w:type="dxa" w:w="1886"/>
+            <w:vAlign w:val="center"/>
           </w:tcPr>
           <w:p>
+            <w:pPr>
+              <w:spacing w:before="40" w:after="40"/>
+              <w:jc w:val="center"/>
+            </w:pPr>
             <w:r>
               <w:rPr>
                 <w:color w:val="000000"/>
@@ -9971,10 +10079,12 @@
         <w:tc>
           <w:tcPr>
             <w:tcW w:type="dxa" w:w="648"/>
+            <w:vAlign w:val="center"/>
           </w:tcPr>
           <w:p>
             <w:pPr>
-              <w:spacing w:after="0"/>
+              <w:spacing w:after="40" w:before="40"/>
+              <w:jc w:val="center"/>
             </w:pPr>
             <w:r>
               <w:rPr>
@@ -9988,51 +10098,57 @@
         <w:tc>
           <w:tcPr>
             <w:tcW w:type="dxa" w:w="2376"/>
+            <w:vAlign w:val="center"/>
           </w:tcPr>
           <w:p>
             <w:pPr>
-              <w:spacing w:after="0"/>
+              <w:spacing w:after="40" w:before="40"/>
+              <w:jc w:val="left"/>
             </w:pPr>
             <w:r>
               <w:rPr>
                 <w:color w:val="000000"/>
                 <w:sz w:val="20"/>
               </w:rPr>
-              <w:t>High-resolution AWS demo</w:t>
+              <w:t>High-resolution AWS experiment</w:t>
             </w:r>
           </w:p>
         </w:tc>
         <w:tc>
           <w:tcPr>
             <w:tcW w:type="dxa" w:w="4594"/>
+            <w:vAlign w:val="center"/>
           </w:tcPr>
           <w:p>
             <w:pPr>
-              <w:spacing w:after="0"/>
+              <w:spacing w:after="40" w:before="40"/>
+              <w:jc w:val="left"/>
             </w:pPr>
             <w:r>
               <w:rPr>
                 <w:color w:val="000000"/>
                 <w:sz w:val="20"/>
               </w:rPr>
-              <w:t>60 actual requests; 10-second periods; abnormal_latency_detected</w:t>
+              <w:t>60 requests; 900 values; two abnormal windows and return toward reference</w:t>
             </w:r>
           </w:p>
         </w:tc>
         <w:tc>
           <w:tcPr>
             <w:tcW w:type="dxa" w:w="1886"/>
+            <w:vAlign w:val="center"/>
           </w:tcPr>
           <w:p>
             <w:pPr>
-              <w:spacing w:after="0"/>
+              <w:spacing w:after="40" w:before="40"/>
+              <w:jc w:val="center"/>
             </w:pPr>
             <w:r>
               <w:rPr>
                 <w:color w:val="000000"/>
                 <w:sz w:val="20"/>
               </w:rPr>
-              <w:t>Measured live</w:t>
+              <w:t>Verified live</w:t>
             </w:r>
           </w:p>
         </w:tc>
@@ -12110,7 +12226,7 @@
         <w:rPr>
           <w:color w:val="000000"/>
         </w:rPr>
-        <w:t>Source code, benchmark adapters, model definitions, scripts, and immutable experimental results are maintained in the project repository under the MIT license. Historical research artifacts remain available, while credentials, local operational databases, and raw monitored telemetry are excluded. The AWS integration was published on main as commit 9866df1 on 16 October 2026. The optional demo changes await review and have not been pushed.</w:t>
+        <w:t>Source code, benchmark adapters, model definitions, scripts, and immutable experimental results are maintained in the project repository under the MIT license. Historical research artifacts remain available; credentials and local operational databases are excluded. Commit 1374b0f on main contains the completed high-resolution AWS integration, dashboard, measured evidence, and report. The submission includes final editorial corrections to that report.</w:t>
       </w:r>
     </w:p>
     <w:p>

</xml_diff>